<commit_message>
fix: preserve policy identities and finalize V4 delivery
</commit_message>
<xml_diff>
--- a/docs/current-project/援航项目实际实现与协作对接总文档.docx
+++ b/docs/current-project/援航项目实际实现与协作对接总文档.docx
@@ -15,7 +15,7 @@
         <w:rPr>
           <w:b w:val="0"/>
         </w:rPr>
-        <w:t>版本：1.0　更新日期：2026年10月19日　产品阶段：V3本机规划与业务仿真系统</w:t>
+        <w:t>版本：1.1　更新日期：2026年10月19日　产品阶段：V4指挥首页与离线策略增强</w:t>
       </w:r>
     </w:p>
     <w:p>
@@ -32,13 +32,13 @@
           <w:color w:val="234C54"/>
           <w:sz w:val="20"/>
         </w:rPr>
-        <w:t>feat/mission-experience-v3</w:t>
+        <w:t>feat/mission-command-v4</w:t>
       </w:r>
       <w:r>
         <w:rPr>
           <w:b w:val="0"/>
         </w:rPr>
-        <w:t xml:space="preserve">，提交 </w:t>
+        <w:t xml:space="preserve">，核心功能提交 </w:t>
       </w:r>
       <w:r>
         <w:rPr>
@@ -47,13 +47,28 @@
           <w:color w:val="234C54"/>
           <w:sz w:val="20"/>
         </w:rPr>
-        <w:t>803c2954a97a0e53e40fb5d3e46c8a212471d60a</w:t>
+        <w:t>3ff456e</w:t>
       </w:r>
       <w:r>
         <w:rPr>
           <w:b w:val="0"/>
         </w:rPr>
-        <w:t>。本文件是该基线的实际实现说明，后续提交应同步更新。文档版本、界面迭代V3、接口Schema版本</w:t>
+        <w:t>及本分支后续界面修复；从V3文档提交</w:t>
+      </w:r>
+      <w:r>
+        <w:rPr>
+          <w:rFonts w:ascii="Consolas" w:hAnsi="Consolas"/>
+          <w:b w:val="0"/>
+          <w:color w:val="234C54"/>
+          <w:sz w:val="20"/>
+        </w:rPr>
+        <w:t>f49911e</w:t>
+      </w:r>
+      <w:r>
+        <w:rPr>
+          <w:b w:val="0"/>
+        </w:rPr>
+        <w:t>出发。V4增加指挥首页、离线策略引擎、案例资产和接入中心，原有物理、联合通信、执行承诺与独立检查继续保留。文档版本、界面迭代V4、接口Schema版本</w:t>
       </w:r>
       <w:r>
         <w:rPr>
@@ -522,7 +537,17 @@
           <w:tcPr>
             <w:tcW w:type="dxa" w:w="4997"/>
           </w:tcPr>
-          <w:p/>
+          <w:p>
+            <w:pPr>
+              <w:spacing w:after="60" w:line="252" w:lineRule="auto"/>
+            </w:pPr>
+            <w:r>
+              <w:rPr>
+                <w:b w:val="0"/>
+              </w:rPr>
+              <w:t>24. V4离线启发式与案例资产实现</w:t>
+            </w:r>
+          </w:p>
         </w:tc>
       </w:tr>
     </w:tbl>
@@ -1679,6 +1704,183 @@
                 <w:sz w:val="20"/>
               </w:rPr>
               <w:t>本项目真实截图与录屏</w:t>
+            </w:r>
+          </w:p>
+        </w:tc>
+      </w:tr>
+      <w:tr>
+        <w:trPr>
+          <w:cantSplit/>
+        </w:trPr>
+        <w:tc>
+          <w:tcPr>
+            <w:tcW w:type="dxa" w:w="1728"/>
+            <w:vAlign w:val="center"/>
+          </w:tcPr>
+          <w:p>
+            <w:pPr>
+              <w:spacing w:before="60" w:after="60" w:line="259" w:lineRule="auto"/>
+            </w:pPr>
+            <w:r>
+              <w:rPr>
+                <w:b w:val="0"/>
+                <w:sz w:val="20"/>
+              </w:rPr>
+              <w:t>首页与案例</w:t>
+            </w:r>
+          </w:p>
+        </w:tc>
+        <w:tc>
+          <w:tcPr>
+            <w:tcW w:type="dxa" w:w="4032"/>
+            <w:vAlign w:val="center"/>
+          </w:tcPr>
+          <w:p>
+            <w:pPr>
+              <w:spacing w:before="60" w:after="60" w:line="259" w:lineRule="auto"/>
+            </w:pPr>
+            <w:r>
+              <w:rPr>
+                <w:b w:val="0"/>
+                <w:sz w:val="20"/>
+              </w:rPr>
+              <w:t>全宽动态地形首页、四类有来源演练、本机任务资产与输入复用</w:t>
+            </w:r>
+          </w:p>
+        </w:tc>
+        <w:tc>
+          <w:tcPr>
+            <w:tcW w:type="dxa" w:w="4234"/>
+            <w:vAlign w:val="center"/>
+          </w:tcPr>
+          <w:p>
+            <w:pPr>
+              <w:spacing w:before="60" w:after="60" w:line="259" w:lineRule="auto"/>
+            </w:pPr>
+            <w:r>
+              <w:rPr>
+                <w:b w:val="0"/>
+                <w:sz w:val="20"/>
+              </w:rPr>
+              <w:t>真实DEM、数据库计数、创建来源和独立任务</w:t>
+            </w:r>
+          </w:p>
+        </w:tc>
+      </w:tr>
+      <w:tr>
+        <w:trPr>
+          <w:cantSplit/>
+        </w:trPr>
+        <w:tc>
+          <w:tcPr>
+            <w:tcW w:type="dxa" w:w="1728"/>
+            <w:vAlign w:val="center"/>
+          </w:tcPr>
+          <w:p>
+            <w:pPr>
+              <w:spacing w:before="60" w:after="60" w:line="259" w:lineRule="auto"/>
+            </w:pPr>
+            <w:r>
+              <w:rPr>
+                <w:b w:val="0"/>
+                <w:sz w:val="20"/>
+              </w:rPr>
+              <w:t>算法引擎</w:t>
+            </w:r>
+          </w:p>
+        </w:tc>
+        <w:tc>
+          <w:tcPr>
+            <w:tcW w:type="dxa" w:w="4032"/>
+            <w:vAlign w:val="center"/>
+          </w:tcPr>
+          <w:p>
+            <w:pPr>
+              <w:spacing w:before="60" w:after="60" w:line="259" w:lineRule="auto"/>
+            </w:pPr>
+            <w:r>
+              <w:rPr>
+                <w:b w:val="0"/>
+                <w:sz w:val="20"/>
+              </w:rPr>
+              <w:t>标准与EOH可选、本地策略导入导出、同输入引擎对比</w:t>
+            </w:r>
+          </w:p>
+        </w:tc>
+        <w:tc>
+          <w:tcPr>
+            <w:tcW w:type="dxa" w:w="4234"/>
+            <w:vAlign w:val="center"/>
+          </w:tcPr>
+          <w:p>
+            <w:pPr>
+              <w:spacing w:before="60" w:after="60" w:line="259" w:lineRule="auto"/>
+            </w:pPr>
+            <w:r>
+              <w:rPr>
+                <w:b w:val="0"/>
+                <w:sz w:val="20"/>
+              </w:rPr>
+              <w:t>策略包版本/SHA256/来源/实际评分调用数</w:t>
+            </w:r>
+          </w:p>
+        </w:tc>
+      </w:tr>
+      <w:tr>
+        <w:trPr>
+          <w:cantSplit/>
+        </w:trPr>
+        <w:tc>
+          <w:tcPr>
+            <w:tcW w:type="dxa" w:w="1728"/>
+            <w:vAlign w:val="center"/>
+          </w:tcPr>
+          <w:p>
+            <w:pPr>
+              <w:spacing w:before="60" w:after="60" w:line="259" w:lineRule="auto"/>
+            </w:pPr>
+            <w:r>
+              <w:rPr>
+                <w:b w:val="0"/>
+                <w:sz w:val="20"/>
+              </w:rPr>
+              <w:t>接入中心</w:t>
+            </w:r>
+          </w:p>
+        </w:tc>
+        <w:tc>
+          <w:tcPr>
+            <w:tcW w:type="dxa" w:w="4032"/>
+            <w:vAlign w:val="center"/>
+          </w:tcPr>
+          <w:p>
+            <w:pPr>
+              <w:spacing w:before="60" w:after="60" w:line="259" w:lineRule="auto"/>
+            </w:pPr>
+            <w:r>
+              <w:rPr>
+                <w:b w:val="0"/>
+                <w:sz w:val="20"/>
+              </w:rPr>
+              <w:t>已安装模拟适配器、实际接口目录、OpenAPI与配置导出</w:t>
+            </w:r>
+          </w:p>
+        </w:tc>
+        <w:tc>
+          <w:tcPr>
+            <w:tcW w:type="dxa" w:w="4234"/>
+            <w:vAlign w:val="center"/>
+          </w:tcPr>
+          <w:p>
+            <w:pPr>
+              <w:spacing w:before="60" w:after="60" w:line="259" w:lineRule="auto"/>
+            </w:pPr>
+            <w:r>
+              <w:rPr>
+                <w:b w:val="0"/>
+                <w:sz w:val="20"/>
+              </w:rPr>
+              <w:t>当前模式与设备状态如实读取，不自动连接真机</w:t>
             </w:r>
           </w:p>
         </w:tc>
@@ -7285,7 +7487,7 @@
                 <w:b w:val="0"/>
                 <w:sz w:val="20"/>
               </w:rPr>
-              <w:t>LandingHome、landing.css</w:t>
+              <w:t>CommandHome、TerrainCommandScene、command-home.css；LandingHome为保留旧实现</w:t>
             </w:r>
           </w:p>
         </w:tc>
@@ -7660,6 +7862,81 @@
                 <w:sz w:val="20"/>
               </w:rPr>
               <w:t>TaskResources、ExperimentCenter、HelpHub</w:t>
+            </w:r>
+          </w:p>
+        </w:tc>
+      </w:tr>
+      <w:tr>
+        <w:trPr>
+          <w:cantSplit/>
+        </w:trPr>
+        <w:tc>
+          <w:tcPr>
+            <w:tcW w:type="dxa" w:w="4997"/>
+            <w:vAlign w:val="center"/>
+          </w:tcPr>
+          <w:p>
+            <w:pPr>
+              <w:spacing w:before="60" w:after="60" w:line="259" w:lineRule="auto"/>
+            </w:pPr>
+            <w:r>
+              <w:rPr>
+                <w:rFonts w:ascii="Consolas" w:hAnsi="Consolas"/>
+                <w:b w:val="0"/>
+                <w:color w:val="234C54"/>
+                <w:sz w:val="20"/>
+              </w:rPr>
+              <w:t>#/cases</w:t>
+            </w:r>
+            <w:r>
+              <w:rPr>
+                <w:b w:val="0"/>
+                <w:sz w:val="20"/>
+              </w:rPr>
+              <w:t>、</w:t>
+            </w:r>
+            <w:r>
+              <w:rPr>
+                <w:rFonts w:ascii="Consolas" w:hAnsi="Consolas"/>
+                <w:b w:val="0"/>
+                <w:color w:val="234C54"/>
+                <w:sz w:val="20"/>
+              </w:rPr>
+              <w:t>#/engines</w:t>
+            </w:r>
+            <w:r>
+              <w:rPr>
+                <w:b w:val="0"/>
+                <w:sz w:val="20"/>
+              </w:rPr>
+              <w:t>、</w:t>
+            </w:r>
+            <w:r>
+              <w:rPr>
+                <w:rFonts w:ascii="Consolas" w:hAnsi="Consolas"/>
+                <w:b w:val="0"/>
+                <w:color w:val="234C54"/>
+                <w:sz w:val="20"/>
+              </w:rPr>
+              <w:t>#/integrations</w:t>
+            </w:r>
+          </w:p>
+        </w:tc>
+        <w:tc>
+          <w:tcPr>
+            <w:tcW w:type="dxa" w:w="4997"/>
+            <w:vAlign w:val="center"/>
+          </w:tcPr>
+          <w:p>
+            <w:pPr>
+              <w:spacing w:before="60" w:after="60" w:line="259" w:lineRule="auto"/>
+            </w:pPr>
+            <w:r>
+              <w:rPr>
+                <w:b w:val="0"/>
+                <w:sz w:val="20"/>
+              </w:rPr>
+              <w:t>CaseLibrary、EngineCenter、IntegrationCenter；command-workspace.css共享字体与配色</w:t>
             </w:r>
           </w:p>
         </w:tc>
@@ -8401,7 +8678,7 @@
         <w:rPr>
           <w:b w:val="0"/>
         </w:rPr>
-        <w:t>基线实际OpenAPI含83个路径模板，部分模板有多个HTTP方法；这不是83个用户功能，也不是216个Schema都独立代表业务模块。完整字段看</w:t>
+        <w:t>V4实际OpenAPI含91个路径模板，部分模板有多个HTTP方法；V3的83路径是历史范围，不是用户功能数量。新增案例/资产聚合、策略包和接入目录。完整字段看</w:t>
       </w:r>
       <w:r>
         <w:rPr>
@@ -11273,7 +11550,7 @@
                 <w:b w:val="0"/>
                 <w:sz w:val="20"/>
               </w:rPr>
-              <w:t>已实现83路径模板，名称按实际OpenAPI</w:t>
+              <w:t>V4实际91路径模板，名称按实际OpenAPI</w:t>
             </w:r>
           </w:p>
         </w:tc>
@@ -11908,7 +12185,7 @@
           <w:rFonts w:ascii="Consolas" w:hAnsi="Consolas" w:eastAsia="微软雅黑"/>
           <w:sz w:val="19"/>
         </w:rPr>
-        <w:t>git clone --branch feat/mission-experience-v3 https://github.com/xiaoroyi/yuanhang-uav-rescue.git</w:t>
+        <w:t>git clone --branch feat/mission-command-v4 https://github.com/xiaoroyi/yuanhang-uav-rescue.git</w:t>
       </w:r>
     </w:p>
     <w:p>
@@ -12513,7 +12790,7 @@
                 <w:color w:val="234C54"/>
                 <w:sz w:val="20"/>
               </w:rPr>
-              <w:t>evidence/experience-v3/HANDOFF.md</w:t>
+              <w:t>evidence/experience-v4/HANDOFF.md</w:t>
             </w:r>
             <w:r>
               <w:rPr>
@@ -12531,6 +12808,13 @@
               </w:rPr>
               <w:t>KNOWN_LIMITATIONS.md</w:t>
             </w:r>
+            <w:r>
+              <w:rPr>
+                <w:b w:val="0"/>
+                <w:sz w:val="20"/>
+              </w:rPr>
+              <w:t>；V3证据保留追溯</w:t>
+            </w:r>
           </w:p>
         </w:tc>
         <w:tc>
@@ -12547,7 +12831,7 @@
                 <w:b w:val="0"/>
                 <w:sz w:val="20"/>
               </w:rPr>
-              <w:t>当前交接、代码位置、未完成条件</w:t>
+              <w:t>当前交接、代码位置、能力边界</w:t>
             </w:r>
           </w:p>
         </w:tc>
@@ -13381,7 +13665,7 @@
           <w:rFonts w:ascii="Arial" w:hAnsi="Arial" w:eastAsia="微软雅黑"/>
           <w:sz w:val="21"/>
         </w:rPr>
-        <w:t>当前产品基线为feat/mission-experience-v3；若已合并或有更新，以本地/远端实际状态为准，</w:t>
+        <w:t>当前产品基线为feat/mission-command-v4；若已合并或有更新，以本地/远端实际状态为准，</w:t>
       </w:r>
     </w:p>
     <w:p>
@@ -13422,7 +13706,7 @@
           <w:rFonts w:ascii="Arial" w:hAnsi="Arial" w:eastAsia="微软雅黑"/>
           <w:sz w:val="21"/>
         </w:rPr>
-        <w:t>docs/IMPLEMENTATION_STATUS.md、evidence/experience-v3/HANDOFF.md与KNOWN_LIMITATIONS.md，</w:t>
+        <w:t>docs/IMPLEMENTATION_STATUS.md、evidence/experience-v4/HANDOFF.md与KNOWN_LIMITATIONS.md，</w:t>
       </w:r>
     </w:p>
     <w:p>
@@ -13553,6 +13837,30 @@
           <w:sz w:val="21"/>
         </w:rPr>
         <w:t>通信联合在途修复、训练学习、完整风场与多基地仍有明确未完成边界。</w:t>
+      </w:r>
+    </w:p>
+    <w:p>
+      <w:pPr>
+        <w:spacing w:after="40" w:line="252" w:lineRule="auto"/>
+      </w:pPr>
+      <w:r>
+        <w:rPr>
+          <w:rFonts w:ascii="Arial" w:hAnsi="Arial" w:eastAsia="微软雅黑"/>
+          <w:sz w:val="21"/>
+        </w:rPr>
+        <w:t>V4的EOH为可选本地评分提供器，内置包来源是规则初始化；不伪称已跑LLM进化或通用提升。</w:t>
+      </w:r>
+    </w:p>
+    <w:p>
+      <w:pPr>
+        <w:spacing w:after="40" w:line="252" w:lineRule="auto"/>
+      </w:pPr>
+      <w:r>
+        <w:rPr>
+          <w:rFonts w:ascii="Arial" w:hAnsi="Arial" w:eastAsia="微软雅黑"/>
+          <w:sz w:val="21"/>
+        </w:rPr>
+        <w:t>先读第24章与RFC-032，再改引擎/策略包/案例来源；不在正常求解中调用模型。</w:t>
       </w:r>
     </w:p>
     <w:p>
@@ -14618,7 +14926,7 @@
         <w:rPr>
           <w:b w:val="0"/>
         </w:rPr>
-        <w:t>、共享契约、生成OpenAPI、当前V3证据和原始只读资料。进一步定位：</w:t>
+        <w:t>、共享契约、生成OpenAPI、V3/V4证据和原始只读资料。进一步定位：</w:t>
       </w:r>
     </w:p>
     <w:p>
@@ -14907,6 +15215,197 @@
           <w:b w:val="0"/>
         </w:rPr>
         <w:t>本文没有进行新的性能竞赛、用户调研或外部法规核验，不提供相应新结论。文字中的完成状态以当前代码与已有证据为依据；后续写本子时可复用说明与技术路线，正式统计、竞争优势和未实现研究需另补证据。</w:t>
+      </w:r>
+    </w:p>
+    <w:p>
+      <w:pPr>
+        <w:pStyle w:val="Heading1"/>
+      </w:pPr>
+      <w:r>
+        <w:t>24 V4离线启发式与案例资产实现</w:t>
+      </w:r>
+    </w:p>
+    <w:p>
+      <w:pPr>
+        <w:pStyle w:val="Heading2"/>
+      </w:pPr>
+      <w:r>
+        <w:t>24.1 首页与字体</w:t>
+      </w:r>
+    </w:p>
+    <w:p>
+      <w:r>
+        <w:rPr>
+          <w:b w:val="0"/>
+        </w:rPr>
+        <w:t>V4首页以CommandHome、TerrainCommandScene和command-home.css实现全宽深蓝指挥界面。主视觉读取项目实际DEM及基地、需求点坐标，最多73×73显示网格，高度显示倍率为8；流动连线是任务网络示意，不冒充求解航线或遥测。首页指标由本机数据库聚合任务、方案、快照和执行数量，缺少数据保留空值。中文Noto Sans SC Variable和数字Inter Variable按OFL许可本地打包，不使用字体CDN。</w:t>
+      </w:r>
+    </w:p>
+    <w:p>
+      <w:r>
+        <w:rPr>
+          <w:b w:val="0"/>
+        </w:rPr>
+        <w:t>粒子、路径流动、策略轨道、进入过渡和数字变化使用已有Motion、Three与CSS；用户开关和系统减少动态效果共同生效。三维循环在不可见或后台时暂停。首页背景铺满视口，正文容器最高1600px，工作台保留独立滚动与地图主体；实际检查覆盖1920、1440、1280和390宽度。</w:t>
+      </w:r>
+    </w:p>
+    <w:p>
+      <w:pPr>
+        <w:pStyle w:val="Heading2"/>
+      </w:pPr>
+      <w:r>
+        <w:t>24.2 可选引擎与实际评分</w:t>
+      </w:r>
+    </w:p>
+    <w:p>
+      <w:r>
+        <w:rPr>
+          <w:b w:val="0"/>
+        </w:rPr>
+        <w:t>标准调度保留原构造、多起点、有限候选约束优化和独立检查。EOH通过solver/engines.py在本地读取评分包，只调整已完成物理和资源分配的候选排序，不放宽硬约束，不改变最终目标。五个输入为标准评分base_score、完成时刻finish_s、航线能耗energy_kwh、箱数cargo_count、质量载荷利用率load_ratio。内置eoh-seed-v1实际使用：</w:t>
+      </w:r>
+    </w:p>
+    <w:p>
+      <w:pPr>
+        <w:keepNext/>
+        <w:spacing w:after="40" w:line="252" w:lineRule="auto"/>
+      </w:pPr>
+      <w:r>
+        <w:rPr>
+          <w:rFonts w:ascii="Consolas" w:hAnsi="Consolas" w:eastAsia="微软雅黑"/>
+          <w:sz w:val="19"/>
+        </w:rPr>
+        <w:t>load_penalty = 1 + 0.12 * (1 - min(1, load_ratio))</w:t>
+      </w:r>
+    </w:p>
+    <w:p>
+      <w:pPr>
+        <w:keepNext/>
+        <w:spacing w:after="40" w:line="252" w:lineRule="auto"/>
+      </w:pPr>
+      <w:r>
+        <w:rPr>
+          <w:rFonts w:ascii="Consolas" w:hAnsi="Consolas" w:eastAsia="微软雅黑"/>
+          <w:sz w:val="19"/>
+        </w:rPr>
+        <w:t>batch_bonus = 1 + 0.025 * min(3, cargo_count)</w:t>
+      </w:r>
+    </w:p>
+    <w:p>
+      <w:pPr>
+        <w:keepNext w:val="0"/>
+        <w:spacing w:after="40" w:line="252" w:lineRule="auto"/>
+      </w:pPr>
+      <w:r>
+        <w:rPr>
+          <w:rFonts w:ascii="Consolas" w:hAnsi="Consolas" w:eastAsia="微软雅黑"/>
+          <w:sz w:val="19"/>
+        </w:rPr>
+        <w:t>score = base_score * load_penalty / batch_bonus</w:t>
+      </w:r>
+    </w:p>
+    <w:p>
+      <w:r>
+        <w:rPr>
+          <w:b w:val="0"/>
+        </w:rPr>
+        <w:t>该包为人工规则初始化rule_initialization，不是LLM进化成果。它真实参与搜索，但不保证每例优于标准引擎。联合模式直接采用其他候选、或深入优化保留原基线时，评分调用可能为0，Plan和界面保留实际调用次数。方案规划支持同一Snapshot、目标和规则下的双引擎比较；资源试算、深入、事件重规划和执行剩余修复的客户端继承原引擎。评测可固定引擎，动态修复评测继承基线，不将引擎改变误归因于资源或方法。</w:t>
+      </w:r>
+    </w:p>
+    <w:p>
+      <w:pPr>
+        <w:pStyle w:val="Heading2"/>
+      </w:pPr>
+      <w:r>
+        <w:t>24.3 策略包和离线工作流</w:t>
+      </w:r>
+    </w:p>
+    <w:p>
+      <w:r>
+        <w:rPr>
+          <w:b w:val="0"/>
+        </w:rPr>
+        <w:t>唯一包合同为contracts/heuristic-artifact.schema.json，后端类型由它生成。格式yuanhang-scalar-v1，记录policy_id、name、version、origin、description、expression和可选evolution_record。在线表达式只允许有限数字、四则运算及min、max、abs、sqrt、log1p；没有导入、属性、循环、任意Python执行或网络。数值异常回退标准评分并计数。</w:t>
+      </w:r>
+    </w:p>
+    <w:p>
+      <w:r>
+        <w:rPr>
+          <w:b w:val="0"/>
+        </w:rPr>
+        <w:t>EngineCenter可导入和导出32KiB以内的包，先检查Schema、AST与数值，再以新ID不可变保存。EOH离线包需附进化记录，但其内容仍是提供者声明，不自动认证训练质量。新SolveRequest/SolverOptions可选engine_type、heuristic_policy_id和heuristic_policy_sha256；提交和Worker分别核对指纹。新Plan.engine保存包版本、来源、SHA256、ranking_evaluations和fallback_evaluations；旧Plan/Snapshot不回填、不改hash，省略引擎保持标准行为。</w:t>
+      </w:r>
+    </w:p>
+    <w:p>
+      <w:r>
+        <w:rPr>
+          <w:b w:val="0"/>
+        </w:rPr>
+        <w:t>scripts/eoh_offline.py适配官方EoH的LLMConfig、EoH和BaseProblem。默认或--describe不发请求，只有显式--run才读取模型环境变量。候选使用真实小场景评估，保存输入指纹、指标和检查结果；合格产物以新ID发布，正常调度只读本地函数。此轮运行了表达式与三例本地接入评估，没有运行外部LLM进化，没有形成独立留出测试、消融或通用提升结论。后续需单独配置模型环境、预算和训练/测试集合，保留失败证据。</w:t>
+      </w:r>
+    </w:p>
+    <w:p>
+      <w:pPr>
+        <w:pStyle w:val="Heading2"/>
+      </w:pPr>
+      <w:r>
+        <w:t>24.4 案例与任务资产</w:t>
+      </w:r>
+    </w:p>
+    <w:p>
+      <w:r>
+        <w:rPr>
+          <w:b w:val="0"/>
+        </w:rPr>
+        <w:t>CaseLibrary内置山地断路、洪涝分级补给、运输通信协同、原题多点急送四类案例。MissionCreate.case_id复用已有幂等创建事务，形成独立场景与任务，source_case_id和创建日志保留来源；不复制旧Plan或交付事实。最近任务、完成/归档任务及输入复用读取既有数据库，新任务、方案、事件与演练持续形成资产。</w:t>
+      </w:r>
+    </w:p>
+    <w:p>
+      <w:r>
+        <w:rPr>
+          <w:b w:val="0"/>
+        </w:rPr>
+        <w:t>计算仍使用项目地理、DEM、机型和箱件。洪涝案例参考Copernicus EMSR517公开背景，在项目区域合成需求优先级，不代表德国或镇龙乡实测救援。OpenTopography SRTM目录是新增区域地形资料入口，Open-Meteo历史气象文档是配置参考；本轮没有下载公共DEM替换项目数据，也没有请求天气API。用途和许可见来源页与docs/experience-v4/RESEARCH.md，不能称真实业务大规模历史库。</w:t>
+      </w:r>
+    </w:p>
+    <w:p>
+      <w:pPr>
+        <w:pStyle w:val="Heading2"/>
+      </w:pPr>
+      <w:r>
+        <w:t>24.5 接入与接口迁移</w:t>
+      </w:r>
+    </w:p>
+    <w:p>
+      <w:r>
+        <w:rPr>
+          <w:b w:val="0"/>
+        </w:rPr>
+        <w:t>IntegrationCenter显示已安装的SimulationAdapter、服务器事件流、指令下发、状态回读及适配方法，提供配置和实际OpenAPI下载。真实设备连接和外部模型在线调用均关闭，不自动连接飞控。DeviceAdapter仍是抽象合同，真机、SITL、服务身份、现场许可另行实施。</w:t>
+      </w:r>
+    </w:p>
+    <w:p>
+      <w:r>
+        <w:rPr>
+          <w:b w:val="0"/>
+        </w:rPr>
+        <w:t>新增八个/api/v1路径模板：GET /case-library、GET /case-library/{case_id}/preview、GET /asset-overview、GET /heuristic-packages、POST /heuristic-packages/import、GET /heuristic-packages/{policy_id}/export、GET /integrations、GET /integrations/configuration。领域Schema由11增至12，实际OpenAPI由83增至91路径，仍为proposed。RFC-032和V4的API_MIGRATION_MAP记录兼容映射。</w:t>
+      </w:r>
+    </w:p>
+    <w:p>
+      <w:pPr>
+        <w:pStyle w:val="Heading2"/>
+      </w:pPr>
+      <w:r>
+        <w:t>24.6 证据与接手</w:t>
+      </w:r>
+    </w:p>
+    <w:p>
+      <w:r>
+        <w:rPr>
+          <w:b w:val="0"/>
+        </w:rPr>
+        <w:t>证据入口evidence/experience-v4/INDEX.md包含专项检查、离线浏览器截图、操作指南、限制和交接。V3实跑数据与论文约束对照保留其历史范围；本轮接入检查不替代独立算法性能实验。先读本文、根/模块AGENTS、当前状态、V4交接、唯一任务板、RFC-032和对应Schema/OpenAPI，再精读相关代码。不从G0重新搭建，不在每次任务中启动模型进化。</w:t>
       </w:r>
     </w:p>
     <w:sectPr>

</xml_diff>

<commit_message>
docs: refresh full handoff and add standalone demo distribution
</commit_message>
<xml_diff>
--- a/docs/current-project/援航项目实际实现与协作对接总文档.docx
+++ b/docs/current-project/援航项目实际实现与协作对接总文档.docx
@@ -15,7 +15,7 @@
         <w:rPr>
           <w:b w:val="0"/>
         </w:rPr>
-        <w:t>版本：1.1　更新日期：2026年10月19日　产品阶段：V4指挥首页与离线策略增强</w:t>
+        <w:t>版本：1.2　更新日期：2026年10月19日　产品阶段：V4完整参考交付与离线策略增强</w:t>
       </w:r>
     </w:p>
     <w:p>
@@ -38,7 +38,7 @@
         <w:rPr>
           <w:b w:val="0"/>
         </w:rPr>
-        <w:t xml:space="preserve">，核心功能提交 </w:t>
+        <w:t>，V4核心功能</w:t>
       </w:r>
       <w:r>
         <w:rPr>
@@ -53,7 +53,7 @@
         <w:rPr>
           <w:b w:val="0"/>
         </w:rPr>
-        <w:t>及本分支后续界面修复；从V3文档提交</w:t>
+        <w:t>、完整交付</w:t>
       </w:r>
       <w:r>
         <w:rPr>
@@ -62,13 +62,13 @@
           <w:color w:val="234C54"/>
           <w:sz w:val="20"/>
         </w:rPr>
-        <w:t>f49911e</w:t>
+        <w:t>e1300fe</w:t>
       </w:r>
       <w:r>
         <w:rPr>
           <w:b w:val="0"/>
         </w:rPr>
-        <w:t>出发。V4增加指挥首页、离线策略引擎、案例资产和接入中心，原有物理、联合通信、执行承诺与独立检查继续保留。文档版本、界面迭代V4、接口Schema版本</w:t>
+        <w:t>及本次文档与参考包修订。V4增加指挥首页、离线策略引擎、案例资产和接入中心，原有物理、联合通信、执行承诺与独立检查继续保留。另有独立传统基线实验补充资料，其实验求解代码不等于已部署的业务引擎。文档版本、界面迭代V4、接口Schema版本</w:t>
       </w:r>
       <w:r>
         <w:rPr>
@@ -171,7 +171,7 @@
               <w:rPr>
                 <w:b w:val="0"/>
               </w:rPr>
-              <w:t>13. 业务仿真、设备接口和状态流</w:t>
+              <w:t>14. 前端页面与可视化实现</w:t>
             </w:r>
           </w:p>
         </w:tc>
@@ -205,7 +205,7 @@
               <w:rPr>
                 <w:b w:val="0"/>
               </w:rPr>
-              <w:t>14. 前端页面与可视化实现</w:t>
+              <w:t>15. 后端、数据库、异步任务与接口</w:t>
             </w:r>
           </w:p>
         </w:tc>
@@ -239,7 +239,7 @@
               <w:rPr>
                 <w:b w:val="0"/>
               </w:rPr>
-              <w:t>15. 后端、数据库、异步任务与接口</w:t>
+              <w:t>16. 已有实跑证据及其适用范围</w:t>
             </w:r>
           </w:p>
         </w:tc>
@@ -273,7 +273,7 @@
               <w:rPr>
                 <w:b w:val="0"/>
               </w:rPr>
-              <w:t>16. 已有实跑证据及其适用范围</w:t>
+              <w:t>17. 与最初开发方案的主要差异</w:t>
             </w:r>
           </w:p>
         </w:tc>
@@ -307,7 +307,7 @@
               <w:rPr>
                 <w:b w:val="0"/>
               </w:rPr>
-              <w:t>17. 与最初开发方案的主要差异</w:t>
+              <w:t>18. 可用于申报材料的项目与创新表述</w:t>
             </w:r>
           </w:p>
         </w:tc>
@@ -341,7 +341,7 @@
               <w:rPr>
                 <w:b w:val="0"/>
               </w:rPr>
-              <w:t>18. 可用于申报材料的项目与创新表述</w:t>
+              <w:t>19. 部署、数据交接与日常运行</w:t>
             </w:r>
           </w:p>
         </w:tc>
@@ -375,7 +375,7 @@
               <w:rPr>
                 <w:b w:val="0"/>
               </w:rPr>
-              <w:t>19. 部署、数据交接与日常运行</w:t>
+              <w:t>20. 无记忆接手的阅读顺序和文件地图</w:t>
             </w:r>
           </w:p>
         </w:tc>
@@ -409,7 +409,7 @@
               <w:rPr>
                 <w:b w:val="0"/>
               </w:rPr>
-              <w:t>20. 无记忆接手的阅读顺序和文件地图</w:t>
+              <w:t>21. 可直接交给队友Codex的提示词</w:t>
             </w:r>
           </w:p>
         </w:tc>
@@ -443,7 +443,7 @@
               <w:rPr>
                 <w:b w:val="0"/>
               </w:rPr>
-              <w:t>21. 可直接交给队友Codex的提示词</w:t>
+              <w:t>22. 后续工作与文档维护约定</w:t>
             </w:r>
           </w:p>
         </w:tc>
@@ -477,7 +477,7 @@
               <w:rPr>
                 <w:b w:val="0"/>
               </w:rPr>
-              <w:t>22. 后续工作与文档维护约定</w:t>
+              <w:t>23. 术语、来源与事实核对说明</w:t>
             </w:r>
           </w:p>
         </w:tc>
@@ -511,7 +511,7 @@
               <w:rPr>
                 <w:b w:val="0"/>
               </w:rPr>
-              <w:t>23. 术语、来源与事实核对说明</w:t>
+              <w:t>24. V4离线启发式与案例资产实现</w:t>
             </w:r>
           </w:p>
         </w:tc>
@@ -545,9 +545,33 @@
               <w:rPr>
                 <w:b w:val="0"/>
               </w:rPr>
-              <w:t>24. V4离线启发式与案例资产实现</w:t>
-            </w:r>
-          </w:p>
+              <w:t>25. 独立传统基线实验与申报引用</w:t>
+            </w:r>
+          </w:p>
+        </w:tc>
+      </w:tr>
+      <w:tr>
+        <w:tc>
+          <w:tcPr>
+            <w:tcW w:type="dxa" w:w="4997"/>
+          </w:tcPr>
+          <w:p>
+            <w:pPr>
+              <w:spacing w:after="60" w:line="252" w:lineRule="auto"/>
+            </w:pPr>
+            <w:r>
+              <w:rPr>
+                <w:b w:val="0"/>
+              </w:rPr>
+              <w:t>13. 业务仿真、设备接口和状态流</w:t>
+            </w:r>
+          </w:p>
+        </w:tc>
+        <w:tc>
+          <w:tcPr>
+            <w:tcW w:type="dxa" w:w="4997"/>
+          </w:tcPr>
+          <w:p/>
         </w:tc>
       </w:tr>
     </w:tbl>
@@ -10565,6 +10589,30 @@
     </w:p>
     <w:p>
       <w:pPr>
+        <w:pStyle w:val="Heading2"/>
+      </w:pPr>
+      <w:r>
+        <w:t>16.3 V4交付证据</w:t>
+      </w:r>
+    </w:p>
+    <w:p>
+      <w:r>
+        <w:rPr>
+          <w:b w:val="0"/>
+        </w:rPr>
+        <w:t>e1300fe交付了全宽动态首页、离线字体、案例资产、可选本地EOH及接入页。最终16项Python专项检查通过，前端严格类型与构建、lint、契约检查和真实浏览器关键流程通过。浏览器使用同一快照的两个实际引擎方案，查看地图、独立调度表、比较图、机队、复盘和教程，并检查1920、1440、1280及390宽度。准确范围见evidence/experience-v4/，没有重跑全部历史长回归。</w:t>
+      </w:r>
+    </w:p>
+    <w:p>
+      <w:r>
+        <w:rPr>
+          <w:b w:val="0"/>
+        </w:rPr>
+        <w:t>V4本机升级时31份Plan与34份Snapshot原文hash全部保留，4个执行实例为3暂停、1完成。后续完整参考包再次以当时数据库一致性备份为准，具体数量和时间写入包内BUNDLE_MANIFEST.json；不能把一次计数当用户永久数据规模。参考包带现有运行记录与前端构建，普通Git clone仍只同步源码和已提交材料。</w:t>
+      </w:r>
+    </w:p>
+    <w:p>
+      <w:pPr>
         <w:pStyle w:val="Heading1"/>
       </w:pPr>
       <w:r>
@@ -12044,6 +12092,65 @@
           </w:p>
         </w:tc>
       </w:tr>
+      <w:tr>
+        <w:trPr>
+          <w:cantSplit/>
+        </w:trPr>
+        <w:tc>
+          <w:tcPr>
+            <w:tcW w:type="dxa" w:w="1728"/>
+            <w:vAlign w:val="center"/>
+          </w:tcPr>
+          <w:p>
+            <w:pPr>
+              <w:spacing w:before="60" w:after="60" w:line="259" w:lineRule="auto"/>
+            </w:pPr>
+            <w:r>
+              <w:rPr>
+                <w:b w:val="0"/>
+                <w:sz w:val="20"/>
+              </w:rPr>
+              <w:t>可追溯的离线启发式接入</w:t>
+            </w:r>
+          </w:p>
+        </w:tc>
+        <w:tc>
+          <w:tcPr>
+            <w:tcW w:type="dxa" w:w="4032"/>
+            <w:vAlign w:val="center"/>
+          </w:tcPr>
+          <w:p>
+            <w:pPr>
+              <w:spacing w:before="60" w:after="60" w:line="259" w:lineRule="auto"/>
+            </w:pPr>
+            <w:r>
+              <w:rPr>
+                <w:b w:val="0"/>
+                <w:sz w:val="20"/>
+              </w:rPr>
+              <w:t>标准/EOH本地评分选择、不可变策略包、同快照比较、实际评分次数与指纹</w:t>
+            </w:r>
+          </w:p>
+        </w:tc>
+        <w:tc>
+          <w:tcPr>
+            <w:tcW w:type="dxa" w:w="4234"/>
+            <w:vAlign w:val="center"/>
+          </w:tcPr>
+          <w:p>
+            <w:pPr>
+              <w:spacing w:before="60" w:after="60" w:line="259" w:lineRule="auto"/>
+            </w:pPr>
+            <w:r>
+              <w:rPr>
+                <w:b w:val="0"/>
+                <w:sz w:val="20"/>
+              </w:rPr>
+              <w:t>规则初始化已接入；未运行LLM进化、训练留出或消融，不能写成已证实的AI性能提升</w:t>
+            </w:r>
+          </w:p>
+        </w:tc>
+      </w:tr>
     </w:tbl>
     <w:p>
       <w:pPr>
@@ -12481,6 +12588,38 @@
     </w:p>
     <w:p>
       <w:pPr>
+        <w:pStyle w:val="Heading2"/>
+      </w:pPr>
+      <w:r>
+        <w:t>19.5 完整参考包</w:t>
+      </w:r>
+    </w:p>
+    <w:p>
+      <w:r>
+        <w:rPr>
+          <w:b w:val="0"/>
+        </w:rPr>
+        <w:t>面向师兄内部阅读与演示的完整参考包为Windows 10/11 x64版。它将当前源码、已构建前端、原题表格与DEM、地图上下文、离线字体、图文与教程视频、现有数据库和已完成Job工作件一起交接，并携带匹配的CPython3.11运行时与项目依赖。解压后双击start.cmd即可启动，不要求另装Python、Node或首次下载依赖。8000端口被占用时用start.cmd --port 8001，不终止未知服务。</w:t>
+      </w:r>
+    </w:p>
+    <w:p>
+      <w:r>
+        <w:rPr>
+          <w:b w:val="0"/>
+        </w:rPr>
+        <w:t>数据通过SQLite backup接口形成一致性快照后恢复到包内runtime，不直接拷贝活动WAL库。包内同时保存这份数据备份；师兄的计算与演练只更新其解压目录，与原作者电脑独立。BUNDLE_MANIFEST.json记录源代码与前端身份、打包时间、表数量、文件大小和SHA256；首次运行前可用portable-python/python.exe scripts/check_reference_bundle.py --initial-data校验。实际使用后数据库发生正常变化，不再用初始数据hash判断是否损坏。</w:t>
+      </w:r>
+    </w:p>
+    <w:p>
+      <w:r>
+        <w:rPr>
+          <w:b w:val="0"/>
+        </w:rPr>
+        <w:t>对外包只保留完整演示所需的程序、原题计算数据和本机任务历史，没有携带Git凭据、浏览器Cookie、账号密码或模型密钥。对外Word为《援航项目介绍与演示指南》，介绍功能、算法和图文操作，不放内部分工、接手提示词、任务板或实验对照。内部总文档与提示词单独留在仓库维护。浏览器头像和配色不复制，新浏览器使用默认深蓝；卫星图仍需联网。核心地形、路线、图表、调度表、教程和计算可离线使用。范围及操作见docs/REFERENCE_DELIVERY.md；不是macOS/Linux或真机控制发行版。</w:t>
+      </w:r>
+    </w:p>
+    <w:p>
+      <w:pPr>
         <w:pStyle w:val="Heading1"/>
       </w:pPr>
       <w:r>
@@ -12500,7 +12639,7 @@
         <w:rPr>
           <w:b w:val="0"/>
         </w:rPr>
-        <w:t>新窗口先读本文，再读下表的规则与当前状态；不需要每次全文重读所有31份RFC和原论文。本文足以理解整体，机器字段与变更仍需精读具体来源。</w:t>
+        <w:t>新窗口先读本文，再读下表的规则与当前状态；不需要每次全文重读所有32份RFC和原论文。本文足以理解整体，机器字段与变更仍需精读具体来源。</w:t>
       </w:r>
     </w:p>
     <w:tbl>
@@ -13682,8 +13821,15 @@
     </w:p>
     <w:p>
       <w:pPr>
-        <w:spacing w:after="0"/>
+        <w:spacing w:after="40" w:line="252" w:lineRule="auto"/>
       </w:pPr>
+      <w:r>
+        <w:rPr>
+          <w:rFonts w:ascii="Arial" w:hAnsi="Arial" w:eastAsia="微软雅黑"/>
+          <w:sz w:val="21"/>
+        </w:rPr>
+        <w:t>若来自完整参考ZIP且没有.git，先读BUNDLE_MANIFEST.json、先读我.txt和docs/PROJECT_DEMO_GUIDE.md，</w:t>
+      </w:r>
     </w:p>
     <w:p>
       <w:pPr>
@@ -13694,43 +13840,7 @@
           <w:rFonts w:ascii="Arial" w:hAnsi="Arial" w:eastAsia="微软雅黑"/>
           <w:sz w:val="21"/>
         </w:rPr>
-        <w:t>二、依次阅读根AGENTS.md、所属模块AGENTS.md、README.md、CONTRIBUTING.md、</w:t>
-      </w:r>
-    </w:p>
-    <w:p>
-      <w:pPr>
-        <w:spacing w:after="40" w:line="252" w:lineRule="auto"/>
-      </w:pPr>
-      <w:r>
-        <w:rPr>
-          <w:rFonts w:ascii="Arial" w:hAnsi="Arial" w:eastAsia="微软雅黑"/>
-          <w:sz w:val="21"/>
-        </w:rPr>
-        <w:t>docs/IMPLEMENTATION_STATUS.md、evidence/experience-v4/HANDOFF.md与KNOWN_LIMITATIONS.md，</w:t>
-      </w:r>
-    </w:p>
-    <w:p>
-      <w:pPr>
-        <w:spacing w:after="40" w:line="252" w:lineRule="auto"/>
-      </w:pPr>
-      <w:r>
-        <w:rPr>
-          <w:rFonts w:ascii="Arial" w:hAnsi="Arial" w:eastAsia="微软雅黑"/>
-          <w:sz w:val="21"/>
-        </w:rPr>
-        <w:t>再读取docs/task-board.json。只对当前任务精读相关Schema、实际OpenAPI、RFC、源码和测试。</w:t>
-      </w:r>
-    </w:p>
-    <w:p>
-      <w:pPr>
-        <w:spacing w:after="40" w:line="252" w:lineRule="auto"/>
-      </w:pPr>
-      <w:r>
-        <w:rPr>
-          <w:rFonts w:ascii="Arial" w:hAnsi="Arial" w:eastAsia="微软雅黑"/>
-          <w:sz w:val="21"/>
-        </w:rPr>
-        <w:t>不要从G0重新搭框架，不把历史三页/九页描述当当前四阶段入口，不沿用三人分工。</w:t>
+        <w:t>按包内指纹识别基线，不初始化或克隆另一份目录覆盖随包runtime。不要运行setup.cmd替换便携环境。</w:t>
       </w:r>
     </w:p>
     <w:p>
@@ -13747,7 +13857,7 @@
           <w:rFonts w:ascii="Arial" w:hAnsi="Arial" w:eastAsia="微软雅黑"/>
           <w:sz w:val="21"/>
         </w:rPr>
-        <w:t>三、长期两人协作：A负责solver/和算法、兼项目负责人；B由同一人负责frontend/、backend/、</w:t>
+        <w:t>二、依次阅读根AGENTS.md、所属模块AGENTS.md、README.md、CONTRIBUTING.md、</w:t>
       </w:r>
     </w:p>
     <w:p>
@@ -13759,7 +13869,7 @@
           <w:rFonts w:ascii="Arial" w:hAnsi="Arial" w:eastAsia="微软雅黑"/>
           <w:sz w:val="21"/>
         </w:rPr>
-        <w:t>数据与集成。历史B-*和C-*任务均归B。本次只实施用户下面明确提出的工作，</w:t>
+        <w:t>docs/IMPLEMENTATION_STATUS.md、evidence/experience-v4/HANDOFF.md与KNOWN_LIMITATIONS.md，</w:t>
       </w:r>
     </w:p>
     <w:p>
@@ -13771,7 +13881,19 @@
           <w:rFonts w:ascii="Arial" w:hAnsi="Arial" w:eastAsia="微软雅黑"/>
           <w:sz w:val="21"/>
         </w:rPr>
-        <w:t>不将过去夜间全栈授权当作以后任意跨模块的永久许可。</w:t>
+        <w:t>再读取docs/task-board.json。只对当前任务精读相关Schema、实际OpenAPI、RFC、源码和测试。</w:t>
+      </w:r>
+    </w:p>
+    <w:p>
+      <w:pPr>
+        <w:spacing w:after="40" w:line="252" w:lineRule="auto"/>
+      </w:pPr>
+      <w:r>
+        <w:rPr>
+          <w:rFonts w:ascii="Arial" w:hAnsi="Arial" w:eastAsia="微软雅黑"/>
+          <w:sz w:val="21"/>
+        </w:rPr>
+        <w:t>不要从G0重新搭框架，不把历史三页/九页描述当当前四阶段入口，不沿用三人分工。</w:t>
       </w:r>
     </w:p>
     <w:p>
@@ -13788,7 +13910,7 @@
           <w:rFonts w:ascii="Arial" w:hAnsi="Arial" w:eastAsia="微软雅黑"/>
           <w:sz w:val="21"/>
         </w:rPr>
-        <w:t>四、保持真实链路和边界：Plan/Snapshot不覆盖；所有展示绑定原Snapshot；</w:t>
+        <w:t>三、长期两人协作：A负责solver/和算法、兼项目负责人；B由同一人负责frontend/、backend/、</w:t>
       </w:r>
     </w:p>
     <w:p>
@@ -13800,7 +13922,7 @@
           <w:rFonts w:ascii="Arial" w:hAnsi="Arial" w:eastAsia="微软雅黑"/>
           <w:sz w:val="21"/>
         </w:rPr>
-        <w:t>Mock/历史/本次Solver/模拟实况分开；null不等于0；新界面tradeoff_v2、旧缺省v1保持兼容。</w:t>
+        <w:t>数据与集成。历史B-*和C-*任务均归B。本次只实施用户下面明确提出的工作，</w:t>
       </w:r>
     </w:p>
     <w:p>
@@ -13812,55 +13934,7 @@
           <w:rFonts w:ascii="Arial" w:hAnsi="Arial" w:eastAsia="微软雅黑"/>
           <w:sz w:val="21"/>
         </w:rPr>
-        <w:t>当前仅业务仿真，无真机/SITL/多用户登录，不把时间能耗折中称公平或人民币成本。</w:t>
-      </w:r>
-    </w:p>
-    <w:p>
-      <w:pPr>
-        <w:spacing w:after="40" w:line="252" w:lineRule="auto"/>
-      </w:pPr>
-      <w:r>
-        <w:rPr>
-          <w:rFonts w:ascii="Arial" w:hAnsi="Arial" w:eastAsia="微软雅黑"/>
-          <w:sz w:val="21"/>
-        </w:rPr>
-        <w:t>在途修复保留已交付与已开始完整架次，不能把全部设备重置从头求解；</w:t>
-      </w:r>
-    </w:p>
-    <w:p>
-      <w:pPr>
-        <w:spacing w:after="40" w:line="252" w:lineRule="auto"/>
-      </w:pPr>
-      <w:r>
-        <w:rPr>
-          <w:rFonts w:ascii="Arial" w:hAnsi="Arial" w:eastAsia="微软雅黑"/>
-          <w:sz w:val="21"/>
-        </w:rPr>
-        <w:t>通信联合在途修复、训练学习、完整风场与多基地仍有明确未完成边界。</w:t>
-      </w:r>
-    </w:p>
-    <w:p>
-      <w:pPr>
-        <w:spacing w:after="40" w:line="252" w:lineRule="auto"/>
-      </w:pPr>
-      <w:r>
-        <w:rPr>
-          <w:rFonts w:ascii="Arial" w:hAnsi="Arial" w:eastAsia="微软雅黑"/>
-          <w:sz w:val="21"/>
-        </w:rPr>
-        <w:t>V4的EOH为可选本地评分提供器，内置包来源是规则初始化；不伪称已跑LLM进化或通用提升。</w:t>
-      </w:r>
-    </w:p>
-    <w:p>
-      <w:pPr>
-        <w:spacing w:after="40" w:line="252" w:lineRule="auto"/>
-      </w:pPr>
-      <w:r>
-        <w:rPr>
-          <w:rFonts w:ascii="Arial" w:hAnsi="Arial" w:eastAsia="微软雅黑"/>
-          <w:sz w:val="21"/>
-        </w:rPr>
-        <w:t>先读第24章与RFC-032，再改引擎/策略包/案例来源；不在正常求解中调用模型。</w:t>
+        <w:t>不将过去夜间全栈授权当作以后任意跨模块的永久许可。</w:t>
       </w:r>
     </w:p>
     <w:p>
@@ -13877,7 +13951,7 @@
           <w:rFonts w:ascii="Arial" w:hAnsi="Arial" w:eastAsia="微软雅黑"/>
           <w:sz w:val="21"/>
         </w:rPr>
-        <w:t>五、修改接口先记录字段/单位/旧新映射和兼容RFC，同步Schema/操作DTO/实际OpenAPI/生成TS/</w:t>
+        <w:t>四、保持真实链路和边界：Plan/Snapshot不覆盖；所有展示绑定原Snapshot；</w:t>
       </w:r>
     </w:p>
     <w:p>
@@ -13889,7 +13963,7 @@
           <w:rFonts w:ascii="Arial" w:hAnsi="Arial" w:eastAsia="微软雅黑"/>
           <w:sz w:val="21"/>
         </w:rPr>
-        <w:t>样例/消费者与必要测试，不用any绕过。不要手改生成文件或代替A/B批准草案。</w:t>
+        <w:t>Mock/历史/本次Solver/模拟实况分开；null不等于0；新界面tradeoff_v2、旧缺省v1保持兼容。</w:t>
       </w:r>
     </w:p>
     <w:p>
@@ -13901,7 +13975,7 @@
           <w:rFonts w:ascii="Arial" w:hAnsi="Arial" w:eastAsia="微软雅黑"/>
           <w:sz w:val="21"/>
         </w:rPr>
-        <w:t>使用独立任务分支，不直接改main、不强推；数据runtime/、依赖、密钥不提交。</w:t>
+        <w:t>当前仅业务仿真，无真机/SITL/多用户登录，不把时间能耗折中称公平或人民币成本。</w:t>
       </w:r>
     </w:p>
     <w:p>
@@ -13913,7 +13987,91 @@
           <w:rFonts w:ascii="Arial" w:hAnsi="Arial" w:eastAsia="微软雅黑"/>
           <w:sz w:val="21"/>
         </w:rPr>
-        <w:t>不连接真实设备、收费服务或进行管理员级修改。</w:t>
+        <w:t>在途修复保留已交付与已开始完整架次，不能把全部设备重置从头求解；</w:t>
+      </w:r>
+    </w:p>
+    <w:p>
+      <w:pPr>
+        <w:spacing w:after="40" w:line="252" w:lineRule="auto"/>
+      </w:pPr>
+      <w:r>
+        <w:rPr>
+          <w:rFonts w:ascii="Arial" w:hAnsi="Arial" w:eastAsia="微软雅黑"/>
+          <w:sz w:val="21"/>
+        </w:rPr>
+        <w:t>通信联合在途修复、训练学习、完整风场与多基地仍有明确未完成边界。</w:t>
+      </w:r>
+    </w:p>
+    <w:p>
+      <w:pPr>
+        <w:spacing w:after="40" w:line="252" w:lineRule="auto"/>
+      </w:pPr>
+      <w:r>
+        <w:rPr>
+          <w:rFonts w:ascii="Arial" w:hAnsi="Arial" w:eastAsia="微软雅黑"/>
+          <w:sz w:val="21"/>
+        </w:rPr>
+        <w:t>V4的EOH为可选本地评分提供器，内置包来源是规则初始化；不伪称已跑LLM进化或通用提升。</w:t>
+      </w:r>
+    </w:p>
+    <w:p>
+      <w:pPr>
+        <w:spacing w:after="40" w:line="252" w:lineRule="auto"/>
+      </w:pPr>
+      <w:r>
+        <w:rPr>
+          <w:rFonts w:ascii="Arial" w:hAnsi="Arial" w:eastAsia="微软雅黑"/>
+          <w:sz w:val="21"/>
+        </w:rPr>
+        <w:t>先读第24章与RFC-032，再改引擎/策略包/案例来源；不在正常求解中调用模型。</w:t>
+      </w:r>
+    </w:p>
+    <w:p>
+      <w:pPr>
+        <w:spacing w:after="40" w:line="252" w:lineRule="auto"/>
+      </w:pPr>
+      <w:r>
+        <w:rPr>
+          <w:rFonts w:ascii="Arial" w:hAnsi="Arial" w:eastAsia="微软雅黑"/>
+          <w:sz w:val="21"/>
+        </w:rPr>
+        <w:t>原题传统方法补充实验见第25章；它与在线引擎不同，论文历史值、无上限实验和有返航上限实验不能混排。</w:t>
+      </w:r>
+    </w:p>
+    <w:p>
+      <w:pPr>
+        <w:spacing w:after="40" w:line="252" w:lineRule="auto"/>
+      </w:pPr>
+      <w:r>
+        <w:rPr>
+          <w:rFonts w:ascii="Arial" w:hAnsi="Arial" w:eastAsia="微软雅黑"/>
+          <w:sz w:val="21"/>
+        </w:rPr>
+        <w:t>后续写本子必须区分现有基础、当前实现、已运行实验与拟研究，UNKNOWN或限时未得解不能写成不可行证明。</w:t>
+      </w:r>
+    </w:p>
+    <w:p>
+      <w:pPr>
+        <w:spacing w:after="40" w:line="252" w:lineRule="auto"/>
+      </w:pPr>
+      <w:r>
+        <w:rPr>
+          <w:rFonts w:ascii="Arial" w:hAnsi="Arial" w:eastAsia="微软雅黑"/>
+          <w:sz w:val="21"/>
+        </w:rPr>
+        <w:t>先核对任务板与最新实验协议、复核状态。进行中的实验不重复启动、不改写输出；</w:t>
+      </w:r>
+    </w:p>
+    <w:p>
+      <w:pPr>
+        <w:spacing w:after="40" w:line="252" w:lineRule="auto"/>
+      </w:pPr>
+      <w:r>
+        <w:rPr>
+          <w:rFonts w:ascii="Arial" w:hAnsi="Arial" w:eastAsia="微软雅黑"/>
+          <w:sz w:val="21"/>
+        </w:rPr>
+        <w:t>未通过最终复核前不引用临时数字，已撤回的比较结论不能继续用于性能宣传。</w:t>
       </w:r>
     </w:p>
     <w:p>
@@ -13930,7 +14088,7 @@
           <w:rFonts w:ascii="Arial" w:hAnsi="Arial" w:eastAsia="微软雅黑"/>
           <w:sz w:val="21"/>
         </w:rPr>
-        <w:t>六、先简要说明当前实现与本次修改点，随后实际编码。复用正确功能，</w:t>
+        <w:t>五、修改接口先记录字段/单位/旧新映射和兼容RFC，同步Schema/操作DTO/实际OpenAPI/生成TS/</w:t>
       </w:r>
     </w:p>
     <w:p>
@@ -13942,7 +14100,7 @@
           <w:rFonts w:ascii="Arial" w:hAnsi="Arial" w:eastAsia="微软雅黑"/>
           <w:sz w:val="21"/>
         </w:rPr>
-        <w:t>按变更影响做必要检查，不反复跑无关全量回归；前端需运行并查看有真实数据的页面，</w:t>
+        <w:t>样例/消费者与必要测试，不用any绕过。不要手改生成文件或代替A/B批准草案。</w:t>
       </w:r>
     </w:p>
     <w:p>
@@ -13954,7 +14112,7 @@
           <w:rFonts w:ascii="Arial" w:hAnsi="Arial" w:eastAsia="微软雅黑"/>
           <w:sz w:val="21"/>
         </w:rPr>
-        <w:t>接口改动需验证消费者；测试使用隔离runtime，不写生产数据。</w:t>
+        <w:t>有Git的开发副本使用独立任务分支，不直接改main、不强推；数据runtime/、依赖、密钥不提交。</w:t>
       </w:r>
     </w:p>
     <w:p>
@@ -13966,7 +14124,19 @@
           <w:rFonts w:ascii="Arial" w:hAnsi="Arial" w:eastAsia="微软雅黑"/>
           <w:sz w:val="21"/>
         </w:rPr>
-        <w:t>若遇真正阻塞，记录具体原因与解除条件，继续可独立推进部分。</w:t>
+        <w:t>参考包接手先保留原始ZIP和一致性备份，在副本或隔离数据目录开发，不覆盖演示记录。</w:t>
+      </w:r>
+    </w:p>
+    <w:p>
+      <w:pPr>
+        <w:spacing w:after="40" w:line="252" w:lineRule="auto"/>
+      </w:pPr>
+      <w:r>
+        <w:rPr>
+          <w:rFonts w:ascii="Arial" w:hAnsi="Arial" w:eastAsia="微软雅黑"/>
+          <w:sz w:val="21"/>
+        </w:rPr>
+        <w:t>不连接真实设备、收费服务或进行管理员级修改。</w:t>
       </w:r>
     </w:p>
     <w:p>
@@ -13983,7 +14153,7 @@
           <w:rFonts w:ascii="Arial" w:hAnsi="Arial" w:eastAsia="微软雅黑"/>
           <w:sz w:val="21"/>
         </w:rPr>
-        <w:t>七、交付时说明实际改动、接口影响、运行方式、已运行检查与未验证范围，</w:t>
+        <w:t>六、先简要说明当前实现与本次修改点，随后实际编码。复用正确功能，</w:t>
       </w:r>
     </w:p>
     <w:p>
@@ -13995,7 +14165,7 @@
           <w:rFonts w:ascii="Arial" w:hAnsi="Arial" w:eastAsia="微软雅黑"/>
           <w:sz w:val="21"/>
         </w:rPr>
-        <w:t>更新唯一任务板和真实状态；涉及本文事实变化同步docs/PROJECT_DOSSIER.md。</w:t>
+        <w:t>按变更影响做必要检查，不反复跑无关全量回归；前端需运行并查看有真实数据的页面，</w:t>
       </w:r>
     </w:p>
     <w:p>
@@ -14007,7 +14177,43 @@
           <w:rFonts w:ascii="Arial" w:hAnsi="Arial" w:eastAsia="微软雅黑"/>
           <w:sz w:val="21"/>
         </w:rPr>
-        <w:t>未经实现/实跑不能把规划写成完成，结束前保留清晰Git状态和下一步入口。</w:t>
+        <w:t>接口改动需验证消费者；测试使用隔离runtime，不写生产数据。</w:t>
+      </w:r>
+    </w:p>
+    <w:p>
+      <w:pPr>
+        <w:spacing w:after="40" w:line="252" w:lineRule="auto"/>
+      </w:pPr>
+      <w:r>
+        <w:rPr>
+          <w:rFonts w:ascii="Arial" w:hAnsi="Arial" w:eastAsia="微软雅黑"/>
+          <w:sz w:val="21"/>
+        </w:rPr>
+        <w:t>参考包默认通过start.cmd使用便携Python与已构建前端；源码开发仍按README建立独立开发环境。</w:t>
+      </w:r>
+    </w:p>
+    <w:p>
+      <w:pPr>
+        <w:spacing w:after="40" w:line="252" w:lineRule="auto"/>
+      </w:pPr>
+      <w:r>
+        <w:rPr>
+          <w:rFonts w:ascii="Arial" w:hAnsi="Arial" w:eastAsia="微软雅黑"/>
+          <w:sz w:val="21"/>
+        </w:rPr>
+        <w:t>不要在演示任务上进行破坏性测试，不把重新生成固定示例当算法求解。</w:t>
+      </w:r>
+    </w:p>
+    <w:p>
+      <w:pPr>
+        <w:spacing w:after="40" w:line="252" w:lineRule="auto"/>
+      </w:pPr>
+      <w:r>
+        <w:rPr>
+          <w:rFonts w:ascii="Arial" w:hAnsi="Arial" w:eastAsia="微软雅黑"/>
+          <w:sz w:val="21"/>
+        </w:rPr>
+        <w:t>若遇真正阻塞，记录具体原因与解除条件，继续可独立推进部分。</w:t>
       </w:r>
     </w:p>
     <w:p>
@@ -14024,7 +14230,48 @@
           <w:rFonts w:ascii="Arial" w:hAnsi="Arial" w:eastAsia="微软雅黑"/>
           <w:sz w:val="21"/>
         </w:rPr>
-        <w:t>本次具体任务：在这里填写要解决的问题、允许修改的模块和可观察的验收结果。</w:t>
+        <w:t>七、交付时说明实际改动、接口影响、运行方式、已运行检查与未验证范围，</w:t>
+      </w:r>
+    </w:p>
+    <w:p>
+      <w:pPr>
+        <w:spacing w:after="40" w:line="252" w:lineRule="auto"/>
+      </w:pPr>
+      <w:r>
+        <w:rPr>
+          <w:rFonts w:ascii="Arial" w:hAnsi="Arial" w:eastAsia="微软雅黑"/>
+          <w:sz w:val="21"/>
+        </w:rPr>
+        <w:t>更新唯一任务板和真实状态；涉及本文事实变化同步docs/PROJECT_DOSSIER.md。</w:t>
+      </w:r>
+    </w:p>
+    <w:p>
+      <w:pPr>
+        <w:spacing w:after="40" w:line="252" w:lineRule="auto"/>
+      </w:pPr>
+      <w:r>
+        <w:rPr>
+          <w:rFonts w:ascii="Arial" w:hAnsi="Arial" w:eastAsia="微软雅黑"/>
+          <w:sz w:val="21"/>
+        </w:rPr>
+        <w:t>未经实现/实跑不能把规划写成完成，结束前保留清晰Git状态和下一步入口。</w:t>
+      </w:r>
+    </w:p>
+    <w:p>
+      <w:pPr>
+        <w:spacing w:after="0"/>
+      </w:pPr>
+    </w:p>
+    <w:p>
+      <w:pPr>
+        <w:spacing w:after="40" w:line="252" w:lineRule="auto"/>
+      </w:pPr>
+      <w:r>
+        <w:rPr>
+          <w:rFonts w:ascii="Arial" w:hAnsi="Arial" w:eastAsia="微软雅黑"/>
+          <w:sz w:val="21"/>
+        </w:rPr>
+        <w:t>本次具体任务：在这里填写阅读交流、申报撰写或开发需求，并说明允许修改的模块与可观察的验收结果。</w:t>
       </w:r>
     </w:p>
     <w:p>
@@ -15406,6 +15653,94 @@
           <w:b w:val="0"/>
         </w:rPr>
         <w:t>证据入口evidence/experience-v4/INDEX.md包含专项检查、离线浏览器截图、操作指南、限制和交接。V3实跑数据与论文约束对照保留其历史范围；本轮接入检查不替代独立算法性能实验。先读本文、根/模块AGENTS、当前状态、V4交接、唯一任务板、RFC-032和对应Schema/OpenAPI，再精读相关代码。不从G0重新搭建，不在每次任务中启动模型进化。</w:t>
+      </w:r>
+    </w:p>
+    <w:p>
+      <w:pPr>
+        <w:pStyle w:val="Heading1"/>
+      </w:pPr>
+      <w:r>
+        <w:t>25 独立传统基线实验与申报引用</w:t>
+      </w:r>
+    </w:p>
+    <w:p>
+      <w:pPr>
+        <w:pStyle w:val="Heading2"/>
+      </w:pPr>
+      <w:r>
+        <w:t>25.1 三批补充实验</w:t>
+      </w:r>
+    </w:p>
+    <w:p>
+      <w:r>
+        <w:rPr>
+          <w:b w:val="0"/>
+        </w:rPr>
+        <w:t>本机另有EXP-C01至EXP-C03的独立研究补充，脚本在scripts/contest_baselines/，报告在docs/current-project/contest-baselines-v1、v2、v3，原始记录在同名evidence目录。这些材料留在仓库研究目录，不进入对外演示包；它们不修改V4在线业务求解器，也不是EOH训练或双引擎性能实验。</w:t>
+      </w:r>
+    </w:p>
+    <w:p>
+      <w:r>
+        <w:rPr>
+          <w:b w:val="0"/>
+        </w:rPr>
+        <w:t>v1为180秒单种子传统方法对照；v2修复贪心构造并使用共同初解，16配置各运行600秒，保存同次搜索180与600秒的32个检查点。v2能耗组没有全部返航上限，不能与论文的短时域节能方案直接排名。Q2专项复查表明较低能耗解满足期望延期和硬截止，但缺少的比较条件是全部返航上限。</w:t>
+      </w:r>
+    </w:p>
+    <w:p>
+      <w:r>
+        <w:rPr>
+          <w:b w:val="0"/>
+        </w:rPr>
+        <w:t>v3曾针对8个能耗配置重设上限，在单种子、850路线/21驻点和600秒预算内均未保留通过全部额外上限的方案。后续EXP-C04排查确认：Q3把归档局部改进合同的运输23架次和68.9999kWh误当作统一成果门槛，候选池也缺少部分合法组批，可行性构造未充分建立。因此v3保留为受限目标搜索的真实失败记录，已经撤回作为正式算法优劣对照的适用性，不能用“全失败”证明传统方法较差。</w:t>
+      </w:r>
+    </w:p>
+    <w:p>
+      <w:pPr>
+        <w:pStyle w:val="Heading2"/>
+      </w:pPr>
+      <w:r>
+        <w:t>25.2 可支持和不能支持的结论</w:t>
+      </w:r>
+    </w:p>
+    <w:p>
+      <w:r>
+        <w:rPr>
+          <w:b w:val="0"/>
+        </w:rPr>
+        <w:t>这些记录可用于说明已开展传统方法对照、约束口径核对、失败保留及原因排查，不意味着已得到可用于优越性主张的正式对照结果。最新有效性状态见evidence/contest-baselines-v3/COMPARISON_STATUS.json与对应全失败原因排查。论文方法本轮未重跑，候选空间和历史预算也未匹配，不能将论文历史结果当同预算现跑结果。</w:t>
+      </w:r>
+    </w:p>
+    <w:p>
+      <w:r>
+        <w:rPr>
+          <w:b w:val="0"/>
+        </w:rPr>
+        <w:t>申报引用优先保留完整协议、数据/候选指纹、全部成功与失败分母以及时间上限。v1、v2、v3并非只改变一个参数，不能将跨版本差异作为严格单因素消融；单原题、单随机种子也没有显著性或泛化依据。后续正式证明学习辅助收益，仍需针对EOH建立独立训练/测试分割、多种子、同条件基线和消融。</w:t>
+      </w:r>
+    </w:p>
+    <w:p>
+      <w:pPr>
+        <w:pStyle w:val="Heading2"/>
+      </w:pPr>
+      <w:r>
+        <w:t>25.3 当前进行中与后续补充</w:t>
+      </w:r>
+    </w:p>
+    <w:p>
+      <w:r>
+        <w:rPr>
+          <w:b w:val="0"/>
+        </w:rPr>
+        <w:t>更新本文时EXP-C05仍在进行，入口为evidence/contest-baselines-v4/plan.json及preparation目录。修订协议保留Q2≤6000秒、Q3≤5939.9秒的共同返航时域，取消按论文结果设置的能耗和架次成果门槛，先构造独立公共候选和完整核验的初解，再进行四种方法、两题、每配置600秒的能耗对照。必须披露共享预处理成本；准备或初解门槛未通过时不能把整组实验标为完成。</w:t>
+      </w:r>
+    </w:p>
+    <w:p>
+      <w:r>
+        <w:rPr>
+          <w:b w:val="0"/>
+        </w:rPr>
+        <w:t>本节只登记进度与协议，不提前填写尚未完成的结果，也不在本轮打包任务中重新启动正在进行的实验。后续产出正式结果后，按最终核验和比较适用性更新本节、报告索引与任务板，同时重新生成Word。EOH的LLM进化、独立留出、多种子和消融另属待验证研究；当前本地规则接入测试不能替代这些实验。</w:t>
       </w:r>
     </w:p>
     <w:sectPr>

</xml_diff>